<commit_message>
fix: update GitHub link in Elastic Beanstalk documentation
</commit_message>
<xml_diff>
--- a/Elastic_Beanstalk/22669691_BuiThienHoang_ElasticBeanstalk.docx
+++ b/Elastic_Beanstalk/22669691_BuiThienHoang_ElasticBeanstalk.docx
@@ -6,33 +6,113 @@
       <w:pPr>
         <w:pStyle w:val="2"/>
         <w:rPr>
-          <w:rFonts w:hint="default" w:ascii="Times New Roman" w:hAnsi="Times New Roman" w:cs="Times New Roman"/>
+          <w:rStyle w:val="13"/>
+          <w:rFonts w:hint="default" w:ascii="Times New Roman" w:hAnsi="Times New Roman" w:cs="Times New Roman"/>
+          <w:b w:val="0"/>
+          <w:bCs w:val="0"/>
+          <w:sz w:val="28"/>
+          <w:szCs w:val="28"/>
+          <w:shd w:val="clear" w:color="auto" w:fill="auto"/>
           <w:lang w:val="en-US"/>
         </w:rPr>
       </w:pPr>
       <w:r>
         <w:rPr>
           <w:rFonts w:hint="default" w:ascii="Times New Roman" w:hAnsi="Times New Roman" w:cs="Times New Roman"/>
+          <w:b w:val="0"/>
+          <w:bCs w:val="0"/>
+          <w:sz w:val="28"/>
+          <w:szCs w:val="28"/>
+          <w:shd w:val="clear" w:color="auto" w:fill="auto"/>
           <w:lang w:val="vi-VN"/>
         </w:rPr>
         <w:t xml:space="preserve">Link github: </w:t>
+      </w:r>
+      <w:r>
+        <w:rPr>
+          <w:rFonts w:hint="default" w:ascii="Times New Roman" w:hAnsi="Times New Roman" w:cs="Times New Roman"/>
+          <w:b w:val="0"/>
+          <w:bCs w:val="0"/>
+          <w:color w:val="auto"/>
+          <w:sz w:val="28"/>
+          <w:szCs w:val="28"/>
+          <w:u w:val="none"/>
+          <w:shd w:val="clear" w:color="auto" w:fill="auto"/>
+          <w:lang w:val="vi-VN"/>
+        </w:rPr>
+        <w:fldChar w:fldCharType="begin"/>
+      </w:r>
+      <w:r>
+        <w:rPr>
+          <w:rFonts w:hint="default" w:ascii="Times New Roman" w:hAnsi="Times New Roman" w:cs="Times New Roman"/>
+          <w:b w:val="0"/>
+          <w:bCs w:val="0"/>
+          <w:color w:val="auto"/>
+          <w:sz w:val="28"/>
+          <w:szCs w:val="28"/>
+          <w:u w:val="none"/>
+          <w:shd w:val="clear" w:color="auto" w:fill="auto"/>
+          <w:lang w:val="vi-VN"/>
+        </w:rPr>
+        <w:instrText xml:space="preserve"> HYPERLINK "https://github.com/BuiThienHoang221204/BuiThienHoang_22669691_CNM/tree/master/Elastic_Beanstalk" </w:instrText>
+      </w:r>
+      <w:r>
+        <w:rPr>
+          <w:rFonts w:hint="default" w:ascii="Times New Roman" w:hAnsi="Times New Roman" w:cs="Times New Roman"/>
+          <w:b w:val="0"/>
+          <w:bCs w:val="0"/>
+          <w:color w:val="auto"/>
+          <w:sz w:val="28"/>
+          <w:szCs w:val="28"/>
+          <w:u w:val="none"/>
+          <w:shd w:val="clear" w:color="auto" w:fill="auto"/>
+          <w:lang w:val="vi-VN"/>
+        </w:rPr>
+        <w:fldChar w:fldCharType="separate"/>
+      </w:r>
+      <w:r>
+        <w:rPr>
+          <w:rStyle w:val="13"/>
+          <w:rFonts w:hint="default" w:ascii="Times New Roman" w:hAnsi="Times New Roman" w:cs="Times New Roman"/>
+          <w:b w:val="0"/>
+          <w:bCs w:val="0"/>
+          <w:sz w:val="28"/>
+          <w:szCs w:val="28"/>
+          <w:shd w:val="clear" w:color="auto" w:fill="auto"/>
+          <w:lang w:val="vi-VN"/>
+        </w:rPr>
+        <w:t>BuiThienHoang_22669691_CNM/Elastic_Beanstalk at master · BuiThienHoang221204/BuiThienHoang_22669691_CNM · GitHub</w:t>
+      </w:r>
+    </w:p>
+    <w:p>
+      <w:pPr>
+        <w:pStyle w:val="2"/>
+        <w:rPr>
+          <w:rFonts w:hint="default" w:ascii="Times New Roman" w:hAnsi="Times New Roman" w:cs="Times New Roman"/>
+        </w:rPr>
+      </w:pPr>
+      <w:r>
+        <w:rPr>
+          <w:rFonts w:hint="default" w:ascii="Times New Roman" w:hAnsi="Times New Roman" w:cs="Times New Roman"/>
+          <w:b w:val="0"/>
+          <w:bCs w:val="0"/>
+          <w:color w:val="auto"/>
+          <w:sz w:val="28"/>
+          <w:szCs w:val="28"/>
+          <w:u w:val="none"/>
+          <w:shd w:val="clear" w:color="auto" w:fill="auto"/>
+          <w:lang w:val="vi-VN"/>
+        </w:rPr>
+        <w:fldChar w:fldCharType="end"/>
+      </w:r>
+      <w:r>
+        <w:rPr>
+          <w:rFonts w:hint="default" w:ascii="Times New Roman" w:hAnsi="Times New Roman" w:cs="Times New Roman"/>
+        </w:rPr>
+        <w:t>Elastic Beanstalk:</w:t>
       </w:r>
       <w:bookmarkStart w:id="0" w:name="_GoBack"/>
       <w:bookmarkEnd w:id="0"/>
-    </w:p>
-    <w:p>
-      <w:pPr>
-        <w:pStyle w:val="2"/>
-        <w:rPr>
-          <w:rFonts w:hint="default" w:ascii="Times New Roman" w:hAnsi="Times New Roman" w:cs="Times New Roman"/>
-        </w:rPr>
-      </w:pPr>
-      <w:r>
-        <w:rPr>
-          <w:rFonts w:hint="default" w:ascii="Times New Roman" w:hAnsi="Times New Roman" w:cs="Times New Roman"/>
-        </w:rPr>
-        <w:t>Elastic Beanstalk:</w:t>
-      </w:r>
     </w:p>
     <w:p>
       <w:pPr>
@@ -768,7 +848,7 @@
   <w:docDefaults>
     <w:rPrDefault>
       <w:rPr>
-        <w:rFonts w:asciiTheme="minorHAnsi" w:hAnsiTheme="minorHAnsi" w:eastAsiaTheme="minorHAnsi" w:cstheme="minorBidi"/>
+        <w:rFonts w:ascii="Times New Roman" w:hAnsi="Times New Roman" w:eastAsia="SimSun" w:cs="Times New Roman"/>
       </w:rPr>
     </w:rPrDefault>
     <w:pPrDefault/>
@@ -1046,7 +1126,7 @@
     <w:name w:val="heading 1"/>
     <w:basedOn w:val="1"/>
     <w:next w:val="1"/>
-    <w:link w:val="16"/>
+    <w:link w:val="17"/>
     <w:qFormat/>
     <w:uiPriority w:val="9"/>
     <w:pPr>
@@ -1066,7 +1146,7 @@
     <w:name w:val="heading 2"/>
     <w:basedOn w:val="1"/>
     <w:next w:val="1"/>
-    <w:link w:val="17"/>
+    <w:link w:val="18"/>
     <w:unhideWhenUsed/>
     <w:qFormat/>
     <w:uiPriority w:val="9"/>
@@ -1087,7 +1167,7 @@
     <w:name w:val="heading 3"/>
     <w:basedOn w:val="1"/>
     <w:next w:val="1"/>
-    <w:link w:val="18"/>
+    <w:link w:val="19"/>
     <w:semiHidden/>
     <w:unhideWhenUsed/>
     <w:qFormat/>
@@ -1109,7 +1189,7 @@
     <w:name w:val="heading 4"/>
     <w:basedOn w:val="1"/>
     <w:next w:val="1"/>
-    <w:link w:val="19"/>
+    <w:link w:val="20"/>
     <w:semiHidden/>
     <w:unhideWhenUsed/>
     <w:qFormat/>
@@ -1131,7 +1211,7 @@
     <w:name w:val="heading 5"/>
     <w:basedOn w:val="1"/>
     <w:next w:val="1"/>
-    <w:link w:val="20"/>
+    <w:link w:val="21"/>
     <w:semiHidden/>
     <w:unhideWhenUsed/>
     <w:qFormat/>
@@ -1151,7 +1231,7 @@
     <w:name w:val="heading 6"/>
     <w:basedOn w:val="1"/>
     <w:next w:val="1"/>
-    <w:link w:val="21"/>
+    <w:link w:val="22"/>
     <w:semiHidden/>
     <w:unhideWhenUsed/>
     <w:qFormat/>
@@ -1181,7 +1261,7 @@
     <w:name w:val="heading 7"/>
     <w:basedOn w:val="1"/>
     <w:next w:val="1"/>
-    <w:link w:val="22"/>
+    <w:link w:val="23"/>
     <w:semiHidden/>
     <w:unhideWhenUsed/>
     <w:qFormat/>
@@ -1209,7 +1289,7 @@
     <w:name w:val="heading 8"/>
     <w:basedOn w:val="1"/>
     <w:next w:val="1"/>
-    <w:link w:val="23"/>
+    <w:link w:val="24"/>
     <w:semiHidden/>
     <w:unhideWhenUsed/>
     <w:qFormat/>
@@ -1239,7 +1319,7 @@
     <w:name w:val="heading 9"/>
     <w:basedOn w:val="1"/>
     <w:next w:val="1"/>
-    <w:link w:val="24"/>
+    <w:link w:val="25"/>
     <w:semiHidden/>
     <w:unhideWhenUsed/>
     <w:qFormat/>
@@ -1285,6 +1365,17 @@
     </w:tblPr>
   </w:style>
   <w:style w:type="character" w:styleId="13">
+    <w:name w:val="FollowedHyperlink"/>
+    <w:basedOn w:val="11"/>
+    <w:semiHidden/>
+    <w:unhideWhenUsed/>
+    <w:uiPriority w:val="99"/>
+    <w:rPr>
+      <w:color w:val="800080"/>
+      <w:u w:val="single"/>
+    </w:rPr>
+  </w:style>
+  <w:style w:type="character" w:styleId="14">
     <w:name w:val="Hyperlink"/>
     <w:basedOn w:val="11"/>
     <w:unhideWhenUsed/>
@@ -1300,11 +1391,11 @@
       </w14:textFill>
     </w:rPr>
   </w:style>
-  <w:style w:type="paragraph" w:styleId="14">
+  <w:style w:type="paragraph" w:styleId="15">
     <w:name w:val="Subtitle"/>
     <w:basedOn w:val="1"/>
     <w:next w:val="1"/>
-    <w:link w:val="26"/>
+    <w:link w:val="27"/>
     <w:qFormat/>
     <w:uiPriority w:val="11"/>
     <w:rPr>
@@ -1323,11 +1414,11 @@
       </w14:textFill>
     </w:rPr>
   </w:style>
-  <w:style w:type="paragraph" w:styleId="15">
+  <w:style w:type="paragraph" w:styleId="16">
     <w:name w:val="Title"/>
     <w:basedOn w:val="1"/>
     <w:next w:val="1"/>
-    <w:link w:val="25"/>
+    <w:link w:val="26"/>
     <w:qFormat/>
     <w:uiPriority w:val="10"/>
     <w:pPr>
@@ -1342,7 +1433,7 @@
       <w:szCs w:val="56"/>
     </w:rPr>
   </w:style>
-  <w:style w:type="character" w:customStyle="1" w:styleId="16">
+  <w:style w:type="character" w:customStyle="1" w:styleId="17">
     <w:name w:val="Heading 1 Char"/>
     <w:basedOn w:val="11"/>
     <w:link w:val="2"/>
@@ -1355,7 +1446,7 @@
       <w:szCs w:val="40"/>
     </w:rPr>
   </w:style>
-  <w:style w:type="character" w:customStyle="1" w:styleId="17">
+  <w:style w:type="character" w:customStyle="1" w:styleId="18">
     <w:name w:val="Heading 2 Char"/>
     <w:basedOn w:val="11"/>
     <w:link w:val="3"/>
@@ -1368,7 +1459,7 @@
       <w:szCs w:val="32"/>
     </w:rPr>
   </w:style>
-  <w:style w:type="character" w:customStyle="1" w:styleId="18">
+  <w:style w:type="character" w:customStyle="1" w:styleId="19">
     <w:name w:val="Heading 3 Char"/>
     <w:basedOn w:val="11"/>
     <w:link w:val="4"/>
@@ -1382,7 +1473,7 @@
       <w:szCs w:val="28"/>
     </w:rPr>
   </w:style>
-  <w:style w:type="character" w:customStyle="1" w:styleId="19">
+  <w:style w:type="character" w:customStyle="1" w:styleId="20">
     <w:name w:val="Heading 4 Char"/>
     <w:basedOn w:val="11"/>
     <w:link w:val="5"/>
@@ -1396,7 +1487,7 @@
       <w:color w:val="104862" w:themeColor="accent1" w:themeShade="BF"/>
     </w:rPr>
   </w:style>
-  <w:style w:type="character" w:customStyle="1" w:styleId="20">
+  <w:style w:type="character" w:customStyle="1" w:styleId="21">
     <w:name w:val="Heading 5 Char"/>
     <w:basedOn w:val="11"/>
     <w:link w:val="6"/>
@@ -1408,7 +1499,7 @@
       <w:color w:val="104862" w:themeColor="accent1" w:themeShade="BF"/>
     </w:rPr>
   </w:style>
-  <w:style w:type="character" w:customStyle="1" w:styleId="21">
+  <w:style w:type="character" w:customStyle="1" w:styleId="22">
     <w:name w:val="Heading 6 Char"/>
     <w:basedOn w:val="11"/>
     <w:link w:val="7"/>
@@ -1430,7 +1521,7 @@
       </w14:textFill>
     </w:rPr>
   </w:style>
-  <w:style w:type="character" w:customStyle="1" w:styleId="22">
+  <w:style w:type="character" w:customStyle="1" w:styleId="23">
     <w:name w:val="Heading 7 Char"/>
     <w:basedOn w:val="11"/>
     <w:link w:val="8"/>
@@ -1450,7 +1541,7 @@
       </w14:textFill>
     </w:rPr>
   </w:style>
-  <w:style w:type="character" w:customStyle="1" w:styleId="23">
+  <w:style w:type="character" w:customStyle="1" w:styleId="24">
     <w:name w:val="Heading 8 Char"/>
     <w:basedOn w:val="11"/>
     <w:link w:val="9"/>
@@ -1472,7 +1563,7 @@
       </w14:textFill>
     </w:rPr>
   </w:style>
-  <w:style w:type="character" w:customStyle="1" w:styleId="24">
+  <w:style w:type="character" w:customStyle="1" w:styleId="25">
     <w:name w:val="Heading 9 Char"/>
     <w:basedOn w:val="11"/>
     <w:link w:val="10"/>
@@ -1492,10 +1583,10 @@
       </w14:textFill>
     </w:rPr>
   </w:style>
-  <w:style w:type="character" w:customStyle="1" w:styleId="25">
+  <w:style w:type="character" w:customStyle="1" w:styleId="26">
     <w:name w:val="Title Char"/>
     <w:basedOn w:val="11"/>
-    <w:link w:val="15"/>
+    <w:link w:val="16"/>
     <w:qFormat/>
     <w:uiPriority w:val="10"/>
     <w:rPr>
@@ -1506,10 +1597,10 @@
       <w:szCs w:val="56"/>
     </w:rPr>
   </w:style>
-  <w:style w:type="character" w:customStyle="1" w:styleId="26">
+  <w:style w:type="character" w:customStyle="1" w:styleId="27">
     <w:name w:val="Subtitle Char"/>
     <w:basedOn w:val="11"/>
-    <w:link w:val="14"/>
+    <w:link w:val="15"/>
     <w:qFormat/>
     <w:uiPriority w:val="11"/>
     <w:rPr>
@@ -1528,11 +1619,11 @@
       </w14:textFill>
     </w:rPr>
   </w:style>
-  <w:style w:type="paragraph" w:styleId="27">
+  <w:style w:type="paragraph" w:styleId="28">
     <w:name w:val="Quote"/>
     <w:basedOn w:val="1"/>
     <w:next w:val="1"/>
-    <w:link w:val="28"/>
+    <w:link w:val="29"/>
     <w:qFormat/>
     <w:uiPriority w:val="29"/>
     <w:pPr>
@@ -1553,10 +1644,10 @@
       </w14:textFill>
     </w:rPr>
   </w:style>
-  <w:style w:type="character" w:customStyle="1" w:styleId="28">
+  <w:style w:type="character" w:customStyle="1" w:styleId="29">
     <w:name w:val="Quote Char"/>
     <w:basedOn w:val="11"/>
-    <w:link w:val="27"/>
+    <w:link w:val="28"/>
     <w:qFormat/>
     <w:uiPriority w:val="29"/>
     <w:rPr>
@@ -1573,7 +1664,7 @@
       </w14:textFill>
     </w:rPr>
   </w:style>
-  <w:style w:type="paragraph" w:styleId="29">
+  <w:style w:type="paragraph" w:styleId="30">
     <w:name w:val="List Paragraph"/>
     <w:basedOn w:val="1"/>
     <w:qFormat/>
@@ -1583,7 +1674,7 @@
       <w:contextualSpacing/>
     </w:pPr>
   </w:style>
-  <w:style w:type="character" w:customStyle="1" w:styleId="30">
+  <w:style w:type="character" w:customStyle="1" w:styleId="31">
     <w:name w:val="Intense Emphasis"/>
     <w:basedOn w:val="11"/>
     <w:qFormat/>
@@ -1594,11 +1685,11 @@
       <w:color w:val="104862" w:themeColor="accent1" w:themeShade="BF"/>
     </w:rPr>
   </w:style>
-  <w:style w:type="paragraph" w:styleId="31">
+  <w:style w:type="paragraph" w:styleId="32">
     <w:name w:val="Intense Quote"/>
     <w:basedOn w:val="1"/>
     <w:next w:val="1"/>
-    <w:link w:val="32"/>
+    <w:link w:val="33"/>
     <w:qFormat/>
     <w:uiPriority w:val="30"/>
     <w:pPr>
@@ -1616,10 +1707,10 @@
       <w:color w:val="104862" w:themeColor="accent1" w:themeShade="BF"/>
     </w:rPr>
   </w:style>
-  <w:style w:type="character" w:customStyle="1" w:styleId="32">
+  <w:style w:type="character" w:customStyle="1" w:styleId="33">
     <w:name w:val="Intense Quote Char"/>
     <w:basedOn w:val="11"/>
-    <w:link w:val="31"/>
+    <w:link w:val="32"/>
     <w:qFormat/>
     <w:uiPriority w:val="30"/>
     <w:rPr>
@@ -1628,7 +1719,7 @@
       <w:color w:val="104862" w:themeColor="accent1" w:themeShade="BF"/>
     </w:rPr>
   </w:style>
-  <w:style w:type="character" w:customStyle="1" w:styleId="33">
+  <w:style w:type="character" w:customStyle="1" w:styleId="34">
     <w:name w:val="Intense Reference"/>
     <w:basedOn w:val="11"/>
     <w:qFormat/>
@@ -1641,7 +1732,7 @@
       <w:spacing w:val="5"/>
     </w:rPr>
   </w:style>
-  <w:style w:type="character" w:customStyle="1" w:styleId="34">
+  <w:style w:type="character" w:customStyle="1" w:styleId="35">
     <w:name w:val="Unresolved Mention"/>
     <w:basedOn w:val="11"/>
     <w:semiHidden/>

</xml_diff>